<commit_message>
docs: TIS Graceful Degradation Model (Modes A/B/C)
Roadmap/architecture only. Records that TIS keeps one workflow + UX across three
modes — Optimization Only (uploaded data), Connected Sales (customer/journey/
sales), Full VANTORA Distribution OS (live visits/GPS/collections/inventory) —
with capabilities enabling/disabling by available data rather than gating the
product. Runtime capability matrix, graceful-empty screens, additive A→B→C
upgrade on one data model, pure engines + enrichment layers. Commercial goal:
standalone / ERP-connected / full customers on one product family + UX.

Co-Authored-By: Claude Opus 4.8 (1M context) <noreply@anthropic.com>
Claude-Session: https://claude.ai/code/session_01AnB42F2fTvBjmAfvzDNk4V
</commit_message>
<xml_diff>
--- a/docs/audits/Territory-Intelligence-Studio-Strategy.docx
+++ b/docs/audits/Territory-Intelligence-Studio-Strategy.docx
@@ -1332,6 +1332,502 @@
         <w:rPr>
           <w:color w:val="1F497D"/>
         </w:rPr>
+        <w:t>4a. Graceful Degradation Model (Modes A / B / C)</w:t>
+      </w:r>
+    </w:p>
+    <w:p>
+      <w:r>
+        <w:rPr>
+          <w:b/>
+        </w:rPr>
+        <w:t>Architecture principle:</w:t>
+      </w:r>
+      <w:r>
+        <w:t xml:space="preserve"> TIS exposes the </w:t>
+      </w:r>
+      <w:r>
+        <w:rPr>
+          <w:b/>
+        </w:rPr>
+        <w:t>same workflow and UX in every mode</w:t>
+      </w:r>
+      <w:r>
+        <w:t>; individual</w:t>
+      </w:r>
+    </w:p>
+    <w:p>
+      <w:r>
+        <w:t xml:space="preserve">capabilities </w:t>
+      </w:r>
+      <w:r>
+        <w:rPr>
+          <w:b/>
+        </w:rPr>
+        <w:t>enable or disable based on available data and enabled modules</w:t>
+      </w:r>
+      <w:r>
+        <w:t>, never gate the</w:t>
+      </w:r>
+    </w:p>
+    <w:p>
+      <w:r>
+        <w:t>product. One product family, three commercial entry points.</w:t>
+      </w:r>
+    </w:p>
+    <w:p>
+      <w:pPr>
+        <w:ind w:left="240"/>
+      </w:pPr>
+      <w:r>
+        <w:rPr>
+          <w:rFonts w:ascii="Consolas" w:hAnsi="Consolas"/>
+          <w:sz w:val="18"/>
+        </w:rPr>
+        <w:t>Upload / Select Customers → Audit → Sizing → Optimization → Planning → Export / Apply</w:t>
+        <w:br/>
+        <w:t xml:space="preserve">                         (identical journey in A, B and C)</w:t>
+      </w:r>
+    </w:p>
+    <w:tbl>
+      <w:tblPr>
+        <w:tblStyle w:val="LightGrid-Accent1"/>
+        <w:tblW w:type="auto" w:w="0"/>
+        <w:jc w:val="center"/>
+        <w:tblLook w:firstColumn="1" w:firstRow="1" w:lastColumn="0" w:lastRow="0" w:noHBand="0" w:noVBand="1" w:val="04A0"/>
+      </w:tblPr>
+      <w:tblGrid>
+        <w:gridCol w:w="2160"/>
+        <w:gridCol w:w="2160"/>
+        <w:gridCol w:w="2160"/>
+        <w:gridCol w:w="2160"/>
+      </w:tblGrid>
+      <w:tr>
+        <w:tc>
+          <w:tcPr>
+            <w:tcW w:type="dxa" w:w="2160"/>
+            <w:shd w:val="clear" w:fill="1F497D"/>
+          </w:tcPr>
+          <w:p/>
+        </w:tc>
+        <w:tc>
+          <w:tcPr>
+            <w:tcW w:type="dxa" w:w="2160"/>
+            <w:shd w:val="clear" w:fill="1F497D"/>
+          </w:tcPr>
+          <w:p>
+            <w:r>
+              <w:rPr>
+                <w:b/>
+                <w:color w:val="FFFFFF"/>
+              </w:rPr>
+              <w:t>Mode A — Optimization Only</w:t>
+            </w:r>
+          </w:p>
+        </w:tc>
+        <w:tc>
+          <w:tcPr>
+            <w:tcW w:type="dxa" w:w="2160"/>
+            <w:shd w:val="clear" w:fill="1F497D"/>
+          </w:tcPr>
+          <w:p>
+            <w:r>
+              <w:rPr>
+                <w:b/>
+                <w:color w:val="FFFFFF"/>
+              </w:rPr>
+              <w:t>Mode B — Connected Sales</w:t>
+            </w:r>
+          </w:p>
+        </w:tc>
+        <w:tc>
+          <w:tcPr>
+            <w:tcW w:type="dxa" w:w="2160"/>
+            <w:shd w:val="clear" w:fill="1F497D"/>
+          </w:tcPr>
+          <w:p>
+            <w:r>
+              <w:rPr>
+                <w:b/>
+                <w:color w:val="FFFFFF"/>
+              </w:rPr>
+              <w:t>Mode C — Full VANTORA Distribution OS</w:t>
+            </w:r>
+          </w:p>
+        </w:tc>
+      </w:tr>
+      <w:tr>
+        <w:tc>
+          <w:tcPr>
+            <w:tcW w:type="dxa" w:w="2160"/>
+          </w:tcPr>
+          <w:p>
+            <w:r>
+              <w:rPr>
+                <w:b/>
+              </w:rPr>
+              <w:t>Inputs</w:t>
+            </w:r>
+          </w:p>
+        </w:tc>
+        <w:tc>
+          <w:tcPr>
+            <w:tcW w:type="dxa" w:w="2160"/>
+          </w:tcPr>
+          <w:p>
+            <w:r>
+              <w:t>Uploaded dataset (Excel/CSV): locations, optional sales value, optional ownership</w:t>
+            </w:r>
+          </w:p>
+        </w:tc>
+        <w:tc>
+          <w:tcPr>
+            <w:tcW w:type="dxa" w:w="2160"/>
+          </w:tcPr>
+          <w:p>
+            <w:r>
+              <w:t>+ customer · journey · sales activity</w:t>
+            </w:r>
+          </w:p>
+        </w:tc>
+        <w:tc>
+          <w:tcPr>
+            <w:tcW w:type="dxa" w:w="2160"/>
+          </w:tcPr>
+          <w:p>
+            <w:r>
+              <w:t>+ live customers · visits · GPS · journey execution · sales · collections · inventory</w:t>
+            </w:r>
+          </w:p>
+        </w:tc>
+      </w:tr>
+      <w:tr>
+        <w:tc>
+          <w:tcPr>
+            <w:tcW w:type="dxa" w:w="2160"/>
+          </w:tcPr>
+          <w:p>
+            <w:r>
+              <w:rPr>
+                <w:b/>
+              </w:rPr>
+              <w:t>Available</w:t>
+            </w:r>
+          </w:p>
+        </w:tc>
+        <w:tc>
+          <w:tcPr>
+            <w:tcW w:type="dxa" w:w="2160"/>
+          </w:tcPr>
+          <w:p>
+            <w:r>
+              <w:t>Territory Audit · Sales Force Sizing · Route Optimization · Visual Territory Planning · Scenario Compare · Map Planning · Excel Export</w:t>
+            </w:r>
+          </w:p>
+        </w:tc>
+        <w:tc>
+          <w:tcPr>
+            <w:tcW w:type="dxa" w:w="2160"/>
+          </w:tcPr>
+          <w:p>
+            <w:r>
+              <w:t>+ Customer 360 · Journey Planning · Coverage Status · Customer Health · sales-based analysis</w:t>
+            </w:r>
+          </w:p>
+        </w:tc>
+        <w:tc>
+          <w:tcPr>
+            <w:tcW w:type="dxa" w:w="2160"/>
+          </w:tcPr>
+          <w:p>
+            <w:r>
+              <w:t>+ Coverage Engine · GPS Compliance · Route Adherence · Geo Intelligence · full Territory + Geo Intelligence</w:t>
+            </w:r>
+          </w:p>
+        </w:tc>
+      </w:tr>
+      <w:tr>
+        <w:tc>
+          <w:tcPr>
+            <w:tcW w:type="dxa" w:w="2160"/>
+          </w:tcPr>
+          <w:p>
+            <w:r>
+              <w:rPr>
+                <w:b/>
+              </w:rPr>
+              <w:t>Not available</w:t>
+            </w:r>
+          </w:p>
+        </w:tc>
+        <w:tc>
+          <w:tcPr>
+            <w:tcW w:type="dxa" w:w="2160"/>
+          </w:tcPr>
+          <w:p>
+            <w:r>
+              <w:t>Live Coverage · GPS Compliance · Visit Execution · Customer Health · Collections · Inventory insights</w:t>
+            </w:r>
+          </w:p>
+        </w:tc>
+        <w:tc>
+          <w:tcPr>
+            <w:tcW w:type="dxa" w:w="2160"/>
+          </w:tcPr>
+          <w:p>
+            <w:r>
+              <w:t>GPS/execution-grade compliance · inventory-driven insights</w:t>
+            </w:r>
+          </w:p>
+        </w:tc>
+        <w:tc>
+          <w:tcPr>
+            <w:tcW w:type="dxa" w:w="2160"/>
+          </w:tcPr>
+          <w:p>
+            <w:r>
+              <w:t>— (full)</w:t>
+            </w:r>
+          </w:p>
+        </w:tc>
+      </w:tr>
+      <w:tr>
+        <w:tc>
+          <w:tcPr>
+            <w:tcW w:type="dxa" w:w="2160"/>
+          </w:tcPr>
+          <w:p>
+            <w:r>
+              <w:rPr>
+                <w:b/>
+              </w:rPr>
+              <w:t>Terminal action</w:t>
+            </w:r>
+          </w:p>
+        </w:tc>
+        <w:tc>
+          <w:tcPr>
+            <w:tcW w:type="dxa" w:w="2160"/>
+          </w:tcPr>
+          <w:p>
+            <w:r>
+              <w:t>Excel Export</w:t>
+            </w:r>
+          </w:p>
+        </w:tc>
+        <w:tc>
+          <w:tcPr>
+            <w:tcW w:type="dxa" w:w="2160"/>
+          </w:tcPr>
+          <w:p>
+            <w:r>
+              <w:t xml:space="preserve">Export </w:t>
+            </w:r>
+            <w:r>
+              <w:rPr>
+                <w:b/>
+              </w:rPr>
+              <w:t>or</w:t>
+            </w:r>
+            <w:r>
+              <w:t xml:space="preserve"> Apply to Journey Plan</w:t>
+            </w:r>
+          </w:p>
+        </w:tc>
+        <w:tc>
+          <w:tcPr>
+            <w:tcW w:type="dxa" w:w="2160"/>
+          </w:tcPr>
+          <w:p>
+            <w:r>
+              <w:t>Apply + publish + execute</w:t>
+            </w:r>
+          </w:p>
+        </w:tc>
+      </w:tr>
+    </w:tbl>
+    <w:p/>
+    <w:p>
+      <w:pPr>
+        <w:pStyle w:val="Heading3"/>
+      </w:pPr>
+      <w:r>
+        <w:t>Design rules</w:t>
+      </w:r>
+    </w:p>
+    <w:p>
+      <w:pPr>
+        <w:pStyle w:val="ListBullet"/>
+      </w:pPr>
+      <w:r>
+        <w:rPr>
+          <w:b/>
+        </w:rPr>
+        <w:t>Capability availability is a function of present data</w:t>
+      </w:r>
+      <w:r>
+        <w:t>, resolved at runtime from a single</w:t>
+      </w:r>
+    </w:p>
+    <w:p>
+      <w:r>
+        <w:rPr>
+          <w:b/>
+        </w:rPr>
+        <w:t>capability matrix</w:t>
+      </w:r>
+      <w:r>
+        <w:t xml:space="preserve"> (which inputs/modules each feature needs) — not hardcoded per build.</w:t>
+      </w:r>
+    </w:p>
+    <w:p>
+      <w:pPr>
+        <w:pStyle w:val="ListBullet"/>
+      </w:pPr>
+      <w:r>
+        <w:rPr>
+          <w:b/>
+        </w:rPr>
+        <w:t>Same screens, graceful empties:</w:t>
+      </w:r>
+      <w:r>
+        <w:t xml:space="preserve"> a feature with missing inputs shows a clear "needs X"</w:t>
+      </w:r>
+    </w:p>
+    <w:p>
+      <w:r>
+        <w:t xml:space="preserve">state or hides, but the </w:t>
+      </w:r>
+      <w:r>
+        <w:rPr>
+          <w:b/>
+        </w:rPr>
+        <w:t>navigation and flow never change</w:t>
+      </w:r>
+      <w:r>
+        <w:t xml:space="preserve"> between modes.</w:t>
+      </w:r>
+    </w:p>
+    <w:p>
+      <w:pPr>
+        <w:pStyle w:val="ListBullet"/>
+      </w:pPr>
+      <w:r>
+        <w:rPr>
+          <w:b/>
+        </w:rPr>
+        <w:t>Upgrade is additive:</w:t>
+      </w:r>
+      <w:r>
+        <w:t xml:space="preserve"> moving A→B→C </w:t>
+      </w:r>
+      <w:r>
+        <w:rPr>
+          <w:b/>
+        </w:rPr>
+        <w:t>adds</w:t>
+      </w:r>
+      <w:r>
+        <w:t xml:space="preserve"> capabilities over the same dataset/UX — no</w:t>
+      </w:r>
+    </w:p>
+    <w:p>
+      <w:r>
+        <w:t>migration, no relearning. A standalone (A) customer's exported plan Applies unchanged in a</w:t>
+      </w:r>
+    </w:p>
+    <w:p>
+      <w:r>
+        <w:t>VANTORA (C) tenant (single data model, §4 / RO §4a).</w:t>
+      </w:r>
+    </w:p>
+    <w:p>
+      <w:pPr>
+        <w:pStyle w:val="ListBullet"/>
+      </w:pPr>
+      <w:r>
+        <w:rPr>
+          <w:b/>
+        </w:rPr>
+        <w:t>Pure engines, layered enrichment:</w:t>
+      </w:r>
+      <w:r>
+        <w:t xml:space="preserve"> Audit/Sizing/Optimization run on the uploaded core</w:t>
+      </w:r>
+    </w:p>
+    <w:p>
+      <w:r>
+        <w:t xml:space="preserve">(Mode A); Coverage/Health/GPS/Geo are </w:t>
+      </w:r>
+      <w:r>
+        <w:rPr>
+          <w:b/>
+        </w:rPr>
+        <w:t>enrichment layers</w:t>
+      </w:r>
+      <w:r>
+        <w:t xml:space="preserve"> that light up as their data</w:t>
+      </w:r>
+    </w:p>
+    <w:p>
+      <w:r>
+        <w:t>arrives (B, C). Consistent with the Coverage Engine façade and FR resolver patterns.</w:t>
+      </w:r>
+    </w:p>
+    <w:p>
+      <w:pPr>
+        <w:pStyle w:val="Heading3"/>
+      </w:pPr>
+      <w:r>
+        <w:t>Commercial objective</w:t>
+      </w:r>
+    </w:p>
+    <w:p>
+      <w:r>
+        <w:t xml:space="preserve">Maximum flexibility from one codebase: </w:t>
+      </w:r>
+      <w:r>
+        <w:rPr>
+          <w:b/>
+        </w:rPr>
+        <w:t>Standalone Optimization</w:t>
+      </w:r>
+      <w:r>
+        <w:t xml:space="preserve"> customers (A),</w:t>
+      </w:r>
+    </w:p>
+    <w:p>
+      <w:r>
+        <w:rPr>
+          <w:b/>
+        </w:rPr>
+        <w:t>ERP-connected</w:t>
+      </w:r>
+      <w:r>
+        <w:t xml:space="preserve"> customers (B), and </w:t>
+      </w:r>
+      <w:r>
+        <w:rPr>
+          <w:b/>
+        </w:rPr>
+        <w:t>Full VANTORA</w:t>
+      </w:r>
+      <w:r>
+        <w:t xml:space="preserve"> customers (C) — same product family, same</w:t>
+      </w:r>
+    </w:p>
+    <w:p>
+      <w:r>
+        <w:t>user experience, capabilities scaled to the data they have.</w:t>
+      </w:r>
+    </w:p>
+    <w:p>
+      <w:pPr>
+        <w:pStyle w:val="Heading2"/>
+      </w:pPr>
+      <w:r>
+        <w:rPr>
+          <w:color w:val="1F497D"/>
+        </w:rPr>
         <w:t>5. Remaining Gaps (to close before TIS is whole)</w:t>
       </w:r>
     </w:p>

</xml_diff>

<commit_message>
docs: TIS Integration Framework (Levels 1-4, connector providers)
Roadmap/architecture only. Records that TIS integrates with external SFA/DMS/ERP/
Route-Planning systems without requiring VANTORA adoption: maturity model L1
file-based (Excel, permanent fallback) → L2 generic connector framework (Customer/
Sales/Visit/JourneyPlan/Route/Territory providers; SalesBuzz/SAP/Odoo/Dynamics/
Salesforce as adapters) → L3 scheduled/delta sync → L4 near-real-time bidirectional
sync. Principles: Excel permanent, no vendor-specific architecture, framework
first, standalone/connected/embedded, external systems are integrations not
dependencies. Capability-aware (ties to graceful degradation §4a) + reuse anchors.

Co-Authored-By: Claude Opus 4.8 (1M context) <noreply@anthropic.com>
Claude-Session: https://claude.ai/code/session_01AnB42F2fTvBjmAfvzDNk4V
</commit_message>
<xml_diff>
--- a/docs/audits/Territory-Intelligence-Studio-Strategy.docx
+++ b/docs/audits/Territory-Intelligence-Studio-Strategy.docx
@@ -1828,6 +1828,551 @@
         <w:rPr>
           <w:color w:val="1F497D"/>
         </w:rPr>
+        <w:t>4b. Integration Framework (future architecture requirement)</w:t>
+      </w:r>
+    </w:p>
+    <w:p>
+      <w:r>
+        <w:rPr>
+          <w:b/>
+        </w:rPr>
+        <w:t>Goal:</w:t>
+      </w:r>
+      <w:r>
+        <w:t xml:space="preserve"> TIS works with external </w:t>
+      </w:r>
+      <w:r>
+        <w:rPr>
+          <w:b/>
+        </w:rPr>
+        <w:t>SFA / DMS / ERP / Route-Planning</w:t>
+      </w:r>
+      <w:r>
+        <w:t xml:space="preserve"> systems **without</w:t>
+      </w:r>
+    </w:p>
+    <w:p>
+      <w:r>
+        <w:t>requiring VANTORA adoption</w:t>
+      </w:r>
+      <w:r>
+        <w:rPr>
+          <w:b/>
+        </w:rPr>
+        <w:t xml:space="preserve">. External systems are </w:t>
+      </w:r>
+      <w:r>
+        <w:t>integrations, not dependencies** — TIS</w:t>
+      </w:r>
+    </w:p>
+    <w:p>
+      <w:r>
+        <w:t>runs standalone, connected, or embedded, on one connector architecture. No vendor-specific</w:t>
+      </w:r>
+    </w:p>
+    <w:p>
+      <w:r>
+        <w:t xml:space="preserve">code paths. </w:t>
+      </w:r>
+      <w:r>
+        <w:rPr>
+          <w:b/>
+        </w:rPr>
+        <w:t>Roadmap only.</w:t>
+      </w:r>
+    </w:p>
+    <w:p>
+      <w:pPr>
+        <w:pStyle w:val="Heading3"/>
+      </w:pPr>
+      <w:r>
+        <w:t>Integration maturity model</w:t>
+      </w:r>
+    </w:p>
+    <w:tbl>
+      <w:tblPr>
+        <w:tblStyle w:val="LightGrid-Accent1"/>
+        <w:tblW w:type="auto" w:w="0"/>
+        <w:jc w:val="center"/>
+        <w:tblLook w:firstColumn="1" w:firstRow="1" w:lastColumn="0" w:lastRow="0" w:noHBand="0" w:noVBand="1" w:val="04A0"/>
+      </w:tblPr>
+      <w:tblGrid>
+        <w:gridCol w:w="2880"/>
+        <w:gridCol w:w="2880"/>
+        <w:gridCol w:w="2880"/>
+      </w:tblGrid>
+      <w:tr>
+        <w:tc>
+          <w:tcPr>
+            <w:tcW w:type="dxa" w:w="2880"/>
+            <w:shd w:val="clear" w:fill="1F497D"/>
+          </w:tcPr>
+          <w:p>
+            <w:r>
+              <w:rPr>
+                <w:b/>
+                <w:color w:val="FFFFFF"/>
+              </w:rPr>
+              <w:t>Level</w:t>
+            </w:r>
+          </w:p>
+        </w:tc>
+        <w:tc>
+          <w:tcPr>
+            <w:tcW w:type="dxa" w:w="2880"/>
+            <w:shd w:val="clear" w:fill="1F497D"/>
+          </w:tcPr>
+          <w:p>
+            <w:r>
+              <w:rPr>
+                <w:b/>
+                <w:color w:val="FFFFFF"/>
+              </w:rPr>
+              <w:t>Capability</w:t>
+            </w:r>
+          </w:p>
+        </w:tc>
+        <w:tc>
+          <w:tcPr>
+            <w:tcW w:type="dxa" w:w="2880"/>
+            <w:shd w:val="clear" w:fill="1F497D"/>
+          </w:tcPr>
+          <w:p>
+            <w:r>
+              <w:rPr>
+                <w:b/>
+                <w:color w:val="FFFFFF"/>
+              </w:rPr>
+              <w:t>Notes</w:t>
+            </w:r>
+          </w:p>
+        </w:tc>
+      </w:tr>
+      <w:tr>
+        <w:tc>
+          <w:tcPr>
+            <w:tcW w:type="dxa" w:w="2880"/>
+          </w:tcPr>
+          <w:p>
+            <w:r>
+              <w:rPr>
+                <w:b/>
+              </w:rPr>
+              <w:t>L1 — File-based</w:t>
+            </w:r>
+          </w:p>
+        </w:tc>
+        <w:tc>
+          <w:tcPr>
+            <w:tcW w:type="dxa" w:w="2880"/>
+          </w:tcPr>
+          <w:p>
+            <w:r>
+              <w:t xml:space="preserve">Excel/CSV </w:t>
+            </w:r>
+            <w:r>
+              <w:rPr>
+                <w:b/>
+              </w:rPr>
+              <w:t>Import + Export</w:t>
+            </w:r>
+          </w:p>
+        </w:tc>
+        <w:tc>
+          <w:tcPr>
+            <w:tcW w:type="dxa" w:w="2880"/>
+          </w:tcPr>
+          <w:p>
+            <w:r>
+              <w:rPr>
+                <w:b/>
+              </w:rPr>
+              <w:t>Mandatory, permanent</w:t>
+            </w:r>
+            <w:r>
+              <w:t xml:space="preserve"> — the universal fallback (already the single data model, §4 / RO §4a).</w:t>
+            </w:r>
+          </w:p>
+        </w:tc>
+      </w:tr>
+      <w:tr>
+        <w:tc>
+          <w:tcPr>
+            <w:tcW w:type="dxa" w:w="2880"/>
+          </w:tcPr>
+          <w:p>
+            <w:r>
+              <w:rPr>
+                <w:b/>
+              </w:rPr>
+              <w:t>L2 — API Connectors</w:t>
+            </w:r>
+          </w:p>
+        </w:tc>
+        <w:tc>
+          <w:tcPr>
+            <w:tcW w:type="dxa" w:w="2880"/>
+          </w:tcPr>
+          <w:p>
+            <w:r>
+              <w:t xml:space="preserve">A </w:t>
+            </w:r>
+            <w:r>
+              <w:rPr>
+                <w:b/>
+              </w:rPr>
+              <w:t>generic connector framework</w:t>
+            </w:r>
+            <w:r>
+              <w:t xml:space="preserve"> (not per-system code)</w:t>
+            </w:r>
+          </w:p>
+        </w:tc>
+        <w:tc>
+          <w:tcPr>
+            <w:tcW w:type="dxa" w:w="2880"/>
+          </w:tcPr>
+          <w:p>
+            <w:r>
+              <w:t>Providers below; vendor connectors plug in.</w:t>
+            </w:r>
+          </w:p>
+        </w:tc>
+      </w:tr>
+      <w:tr>
+        <w:tc>
+          <w:tcPr>
+            <w:tcW w:type="dxa" w:w="2880"/>
+          </w:tcPr>
+          <w:p>
+            <w:r>
+              <w:rPr>
+                <w:b/>
+              </w:rPr>
+              <w:t>L3 — Scheduled Sync</w:t>
+            </w:r>
+          </w:p>
+        </w:tc>
+        <w:tc>
+          <w:tcPr>
+            <w:tcW w:type="dxa" w:w="2880"/>
+          </w:tcPr>
+          <w:p>
+            <w:r>
+              <w:t xml:space="preserve">Scheduled import/export · </w:t>
+            </w:r>
+            <w:r>
+              <w:rPr>
+                <w:b/>
+              </w:rPr>
+              <w:t>delta sync</w:t>
+            </w:r>
+            <w:r>
+              <w:t xml:space="preserve"> · refresh jobs</w:t>
+            </w:r>
+          </w:p>
+        </w:tc>
+        <w:tc>
+          <w:tcPr>
+            <w:tcW w:type="dxa" w:w="2880"/>
+          </w:tcPr>
+          <w:p>
+            <w:r>
+              <w:t>Reuse the scheduler/job pattern.</w:t>
+            </w:r>
+          </w:p>
+        </w:tc>
+      </w:tr>
+      <w:tr>
+        <w:tc>
+          <w:tcPr>
+            <w:tcW w:type="dxa" w:w="2880"/>
+          </w:tcPr>
+          <w:p>
+            <w:r>
+              <w:rPr>
+                <w:b/>
+              </w:rPr>
+              <w:t>L4 — Near-real-time</w:t>
+            </w:r>
+          </w:p>
+        </w:tc>
+        <w:tc>
+          <w:tcPr>
+            <w:tcW w:type="dxa" w:w="2880"/>
+          </w:tcPr>
+          <w:p>
+            <w:r>
+              <w:t xml:space="preserve">Bi-directional </w:t>
+            </w:r>
+            <w:r>
+              <w:rPr>
+                <w:rFonts w:ascii="Consolas" w:hAnsi="Consolas"/>
+                <w:sz w:val="19"/>
+              </w:rPr>
+              <w:t>External ↔ TIS</w:t>
+            </w:r>
+            <w:r>
+              <w:t xml:space="preserve">: customer · journey-plan · route · visit · </w:t>
+            </w:r>
+            <w:r>
+              <w:rPr>
+                <w:b/>
+              </w:rPr>
+              <w:t>coverage</w:t>
+            </w:r>
+            <w:r>
+              <w:t xml:space="preserve"> sync</w:t>
+            </w:r>
+          </w:p>
+        </w:tc>
+        <w:tc>
+          <w:tcPr>
+            <w:tcW w:type="dxa" w:w="2880"/>
+          </w:tcPr>
+          <w:p>
+            <w:r>
+              <w:t>Forward-looking.</w:t>
+            </w:r>
+          </w:p>
+        </w:tc>
+      </w:tr>
+    </w:tbl>
+    <w:p/>
+    <w:p>
+      <w:pPr>
+        <w:pStyle w:val="Heading3"/>
+      </w:pPr>
+      <w:r>
+        <w:t>Connector framework (L2) — provider interfaces, not implementations</w:t>
+      </w:r>
+    </w:p>
+    <w:p>
+      <w:r>
+        <w:t xml:space="preserve">A small set of </w:t>
+      </w:r>
+      <w:r>
+        <w:rPr>
+          <w:b/>
+        </w:rPr>
+        <w:t>provider contracts</w:t>
+      </w:r>
+      <w:r>
+        <w:t xml:space="preserve"> the platform consumes; every external system is just an</w:t>
+      </w:r>
+    </w:p>
+    <w:p>
+      <w:r>
+        <w:t>adapter that satisfies them:</w:t>
+      </w:r>
+    </w:p>
+    <w:p>
+      <w:pPr>
+        <w:ind w:left="240"/>
+      </w:pPr>
+      <w:r>
+        <w:rPr>
+          <w:rFonts w:ascii="Consolas" w:hAnsi="Consolas"/>
+          <w:sz w:val="18"/>
+        </w:rPr>
+        <w:t>CustomerProvider · SalesProvider · VisitProvider ·</w:t>
+        <w:br/>
+        <w:t>JourneyPlanProvider · RouteProvider · TerritoryProvider</w:t>
+      </w:r>
+    </w:p>
+    <w:p>
+      <w:pPr>
+        <w:pStyle w:val="ListBullet"/>
+      </w:pPr>
+      <w:r>
+        <w:t xml:space="preserve">Each provider maps an external system's data to the </w:t>
+      </w:r>
+      <w:r>
+        <w:rPr>
+          <w:b/>
+        </w:rPr>
+        <w:t>TIS canonical dataset</w:t>
+      </w:r>
+      <w:r>
+        <w:t xml:space="preserve"> (§4 single</w:t>
+      </w:r>
+    </w:p>
+    <w:p>
+      <w:r>
+        <w:t>model) — so Audit / Sizing / Optimization / Coverage consume one shape regardless of source.</w:t>
+      </w:r>
+    </w:p>
+    <w:p>
+      <w:pPr>
+        <w:pStyle w:val="ListBullet"/>
+      </w:pPr>
+      <w:r>
+        <w:t xml:space="preserve">Vendor connectors — </w:t>
+      </w:r>
+      <w:r>
+        <w:rPr>
+          <w:b/>
+        </w:rPr>
+        <w:t>SalesBuzz · SAP · Odoo · Dynamics · Salesforce</w:t>
+      </w:r>
+      <w:r>
+        <w:t xml:space="preserve"> — are **consumers of</w:t>
+      </w:r>
+    </w:p>
+    <w:p>
+      <w:r>
+        <w:t>the same framework**, shipped/maintained independently of the core. No connector is special.</w:t>
+      </w:r>
+    </w:p>
+    <w:p>
+      <w:pPr>
+        <w:pStyle w:val="ListBullet"/>
+      </w:pPr>
+      <w:r>
+        <w:t xml:space="preserve">The framework is </w:t>
+      </w:r>
+      <w:r>
+        <w:rPr>
+          <w:b/>
+        </w:rPr>
+        <w:t>capability-aware</w:t>
+      </w:r>
+      <w:r>
+        <w:t xml:space="preserve"> (§4a): a connector that supplies only customers+sales</w:t>
+      </w:r>
+    </w:p>
+    <w:p>
+      <w:r>
+        <w:t>lights up Mode B; one that adds visits/GPS reaches Mode C.</w:t>
+      </w:r>
+    </w:p>
+    <w:p>
+      <w:pPr>
+        <w:pStyle w:val="Heading3"/>
+      </w:pPr>
+      <w:r>
+        <w:t>Design principles</w:t>
+      </w:r>
+    </w:p>
+    <w:p>
+      <w:pPr>
+        <w:pStyle w:val="ListNumber"/>
+      </w:pPr>
+      <w:r>
+        <w:rPr>
+          <w:b/>
+        </w:rPr>
+        <w:t>Excel is supported permanently</w:t>
+      </w:r>
+      <w:r>
+        <w:t xml:space="preserve"> (L1 never deprecated).</w:t>
+      </w:r>
+    </w:p>
+    <w:p>
+      <w:pPr>
+        <w:pStyle w:val="ListNumber"/>
+      </w:pPr>
+      <w:r>
+        <w:rPr>
+          <w:b/>
+        </w:rPr>
+        <w:t>No vendor-specific architecture</w:t>
+      </w:r>
+      <w:r>
+        <w:t xml:space="preserve"> — one framework, many adapters.</w:t>
+      </w:r>
+    </w:p>
+    <w:p>
+      <w:pPr>
+        <w:pStyle w:val="ListNumber"/>
+      </w:pPr>
+      <w:r>
+        <w:rPr>
+          <w:b/>
+        </w:rPr>
+        <w:t>Build the connector framework first</w:t>
+      </w:r>
+      <w:r>
+        <w:t>, then connectors.</w:t>
+      </w:r>
+    </w:p>
+    <w:p>
+      <w:pPr>
+        <w:pStyle w:val="ListNumber"/>
+      </w:pPr>
+      <w:r>
+        <w:t xml:space="preserve">TIS must operate </w:t>
+      </w:r>
+      <w:r>
+        <w:rPr>
+          <w:b/>
+        </w:rPr>
+        <w:t>standalone · connected to external systems · embedded in VANTORA</w:t>
+      </w:r>
+      <w:r>
+        <w:t>.</w:t>
+      </w:r>
+    </w:p>
+    <w:p>
+      <w:pPr>
+        <w:pStyle w:val="ListNumber"/>
+      </w:pPr>
+      <w:r>
+        <w:rPr>
+          <w:b/>
+        </w:rPr>
+        <w:t>External systems are integrations, not dependencies</w:t>
+      </w:r>
+      <w:r>
+        <w:t xml:space="preserve"> — absence degrades gracefully (§4a),</w:t>
+      </w:r>
+    </w:p>
+    <w:p>
+      <w:r>
+        <w:t>never blocks.</w:t>
+      </w:r>
+    </w:p>
+    <w:p>
+      <w:pPr>
+        <w:pStyle w:val="Heading3"/>
+      </w:pPr>
+      <w:r>
+        <w:t>Reuse anchors</w:t>
+      </w:r>
+    </w:p>
+    <w:p>
+      <w:r>
+        <w:t>Existing import/export pipeline (entity descriptors, ref resolution) → L1; the integration</w:t>
+      </w:r>
+    </w:p>
+    <w:p>
+      <w:r>
+        <w:t>ingest path (</w:t>
+      </w:r>
+      <w:r>
+        <w:rPr>
+          <w:rFonts w:ascii="Consolas" w:hAnsi="Consolas"/>
+          <w:sz w:val="19"/>
+        </w:rPr>
+        <w:t>integration-ingest.ts</w:t>
+      </w:r>
+      <w:r>
+        <w:t>) and feature/connector patterns → L2/L3; the single data</w:t>
+      </w:r>
+    </w:p>
+    <w:p>
+      <w:r>
+        <w:t>model + FR/Coverage read-models → the canonical target every provider maps to.</w:t>
+      </w:r>
+    </w:p>
+    <w:p>
+      <w:pPr>
+        <w:pStyle w:val="Heading2"/>
+      </w:pPr>
+      <w:r>
+        <w:rPr>
+          <w:color w:val="1F497D"/>
+        </w:rPr>
         <w:t>5. Remaining Gaps (to close before TIS is whole)</w:t>
       </w:r>
     </w:p>

</xml_diff>

<commit_message>
docs: TIS connectors — Google Sheets first-class + connector priority ladder
Roadmap only. Adds Google Sheets as a first-class connector target (import/export/
scheduled sync/write-back of optimized routes + journey plans) for spreadsheet-
native SMBs, and a connector priority ladder distinct from the maturity model:
P1 Excel/CSV → P2 Google Sheets → P3 SalesBuzz/Mira/Mirna/Odoo →
P4 SAP/Dynamics/Salesforce/Oracle. All tiers are adapters over one connector
framework; no bespoke architecture per tier.

Co-Authored-By: Claude Opus 4.8 (1M context) <noreply@anthropic.com>
Claude-Session: https://claude.ai/code/session_01AnB42F2fTvBjmAfvzDNk4V
</commit_message>
<xml_diff>
--- a/docs/audits/Territory-Intelligence-Studio-Strategy.docx
+++ b/docs/audits/Territory-Intelligence-Studio-Strategy.docx
@@ -2251,6 +2251,360 @@
         <w:pStyle w:val="Heading3"/>
       </w:pPr>
       <w:r>
+        <w:t>Google Sheets — first-class connector target</w:t>
+      </w:r>
+    </w:p>
+    <w:p>
+      <w:r>
+        <w:t xml:space="preserve">Beyond Excel/CSV files, </w:t>
+      </w:r>
+      <w:r>
+        <w:rPr>
+          <w:b/>
+        </w:rPr>
+        <w:t>Google Sheets is a first-class connector</w:t>
+      </w:r>
+      <w:r>
+        <w:t xml:space="preserve"> (not a generic adapter),</w:t>
+      </w:r>
+    </w:p>
+    <w:p>
+      <w:r>
+        <w:t>to serve SMBs that operate directly from spreadsheets without ERP adoption. It supports:</w:t>
+      </w:r>
+    </w:p>
+    <w:p>
+      <w:pPr>
+        <w:pStyle w:val="ListBullet"/>
+      </w:pPr>
+      <w:r>
+        <w:rPr>
+          <w:b/>
+        </w:rPr>
+        <w:t>Import · Export</w:t>
+      </w:r>
+      <w:r>
+        <w:t xml:space="preserve"> (live sheet ↔ TIS canonical dataset)</w:t>
+      </w:r>
+    </w:p>
+    <w:p>
+      <w:pPr>
+        <w:pStyle w:val="ListBullet"/>
+      </w:pPr>
+      <w:r>
+        <w:rPr>
+          <w:b/>
+        </w:rPr>
+        <w:t>Scheduled Sync</w:t>
+      </w:r>
+      <w:r>
+        <w:t xml:space="preserve"> (L3 pattern — periodic refresh + delta)</w:t>
+      </w:r>
+    </w:p>
+    <w:p>
+      <w:pPr>
+        <w:pStyle w:val="ListBullet"/>
+      </w:pPr>
+      <w:r>
+        <w:rPr>
+          <w:b/>
+        </w:rPr>
+        <w:t>Write-back</w:t>
+      </w:r>
+      <w:r>
+        <w:t xml:space="preserve"> of </w:t>
+      </w:r>
+      <w:r>
+        <w:rPr>
+          <w:b/>
+        </w:rPr>
+        <w:t>optimized routes and journey plans</w:t>
+      </w:r>
+      <w:r>
+        <w:t xml:space="preserve"> into the user's sheet</w:t>
+      </w:r>
+    </w:p>
+    <w:p>
+      <w:r>
+        <w:t xml:space="preserve">This makes the full </w:t>
+      </w:r>
+      <w:r>
+        <w:rPr>
+          <w:rFonts w:ascii="Consolas" w:hAnsi="Consolas"/>
+          <w:sz w:val="19"/>
+        </w:rPr>
+        <w:t>Upload → Audit → Sizing → Optimization → Planning → Export/Write-back</w:t>
+      </w:r>
+    </w:p>
+    <w:p>
+      <w:r>
+        <w:t>loop work end-to-end on a Google Sheet — the lightest-weight Mode A entry point.</w:t>
+      </w:r>
+    </w:p>
+    <w:p>
+      <w:pPr>
+        <w:pStyle w:val="Heading3"/>
+      </w:pPr>
+      <w:r>
+        <w:t>Connector Priority Ladder (rollout order)</w:t>
+      </w:r>
+    </w:p>
+    <w:p>
+      <w:r>
+        <w:t xml:space="preserve">Distinct from the *maturity model* (capability axis) above, this is the </w:t>
+      </w:r>
+      <w:r>
+        <w:rPr>
+          <w:b/>
+        </w:rPr>
+        <w:t>sequencing</w:t>
+      </w:r>
+      <w:r>
+        <w:t xml:space="preserve"> of which</w:t>
+      </w:r>
+    </w:p>
+    <w:p>
+      <w:r>
+        <w:t>sources to build, lightest/highest-reach first:</w:t>
+      </w:r>
+    </w:p>
+    <w:tbl>
+      <w:tblPr>
+        <w:tblStyle w:val="LightGrid-Accent1"/>
+        <w:tblW w:type="auto" w:w="0"/>
+        <w:jc w:val="center"/>
+        <w:tblLook w:firstColumn="1" w:firstRow="1" w:lastColumn="0" w:lastRow="0" w:noHBand="0" w:noVBand="1" w:val="04A0"/>
+      </w:tblPr>
+      <w:tblGrid>
+        <w:gridCol w:w="2880"/>
+        <w:gridCol w:w="2880"/>
+        <w:gridCol w:w="2880"/>
+      </w:tblGrid>
+      <w:tr>
+        <w:tc>
+          <w:tcPr>
+            <w:tcW w:type="dxa" w:w="2880"/>
+            <w:shd w:val="clear" w:fill="1F497D"/>
+          </w:tcPr>
+          <w:p>
+            <w:r>
+              <w:rPr>
+                <w:b/>
+                <w:color w:val="FFFFFF"/>
+              </w:rPr>
+              <w:t>Tier</w:t>
+            </w:r>
+          </w:p>
+        </w:tc>
+        <w:tc>
+          <w:tcPr>
+            <w:tcW w:type="dxa" w:w="2880"/>
+            <w:shd w:val="clear" w:fill="1F497D"/>
+          </w:tcPr>
+          <w:p>
+            <w:r>
+              <w:rPr>
+                <w:b/>
+                <w:color w:val="FFFFFF"/>
+              </w:rPr>
+              <w:t>Connectors</w:t>
+            </w:r>
+          </w:p>
+        </w:tc>
+        <w:tc>
+          <w:tcPr>
+            <w:tcW w:type="dxa" w:w="2880"/>
+            <w:shd w:val="clear" w:fill="1F497D"/>
+          </w:tcPr>
+          <w:p>
+            <w:r>
+              <w:rPr>
+                <w:b/>
+                <w:color w:val="FFFFFF"/>
+              </w:rPr>
+              <w:t>Rationale</w:t>
+            </w:r>
+          </w:p>
+        </w:tc>
+      </w:tr>
+      <w:tr>
+        <w:tc>
+          <w:tcPr>
+            <w:tcW w:type="dxa" w:w="2880"/>
+          </w:tcPr>
+          <w:p>
+            <w:r>
+              <w:rPr>
+                <w:b/>
+              </w:rPr>
+              <w:t>P1</w:t>
+            </w:r>
+          </w:p>
+        </w:tc>
+        <w:tc>
+          <w:tcPr>
+            <w:tcW w:type="dxa" w:w="2880"/>
+          </w:tcPr>
+          <w:p>
+            <w:r>
+              <w:rPr>
+                <w:b/>
+              </w:rPr>
+              <w:t>Excel · CSV</w:t>
+            </w:r>
+          </w:p>
+        </w:tc>
+        <w:tc>
+          <w:tcPr>
+            <w:tcW w:type="dxa" w:w="2880"/>
+          </w:tcPr>
+          <w:p>
+            <w:r>
+              <w:t>Universal, mandatory, permanent (L1)</w:t>
+            </w:r>
+          </w:p>
+        </w:tc>
+      </w:tr>
+      <w:tr>
+        <w:tc>
+          <w:tcPr>
+            <w:tcW w:type="dxa" w:w="2880"/>
+          </w:tcPr>
+          <w:p>
+            <w:r>
+              <w:rPr>
+                <w:b/>
+              </w:rPr>
+              <w:t>P2</w:t>
+            </w:r>
+          </w:p>
+        </w:tc>
+        <w:tc>
+          <w:tcPr>
+            <w:tcW w:type="dxa" w:w="2880"/>
+          </w:tcPr>
+          <w:p>
+            <w:r>
+              <w:rPr>
+                <w:b/>
+              </w:rPr>
+              <w:t>Google Sheets</w:t>
+            </w:r>
+          </w:p>
+        </w:tc>
+        <w:tc>
+          <w:tcPr>
+            <w:tcW w:type="dxa" w:w="2880"/>
+          </w:tcPr>
+          <w:p>
+            <w:r>
+              <w:t>SMB spreadsheet-native; import/export/scheduled/write-back</w:t>
+            </w:r>
+          </w:p>
+        </w:tc>
+      </w:tr>
+      <w:tr>
+        <w:tc>
+          <w:tcPr>
+            <w:tcW w:type="dxa" w:w="2880"/>
+          </w:tcPr>
+          <w:p>
+            <w:r>
+              <w:rPr>
+                <w:b/>
+              </w:rPr>
+              <w:t>P3</w:t>
+            </w:r>
+          </w:p>
+        </w:tc>
+        <w:tc>
+          <w:tcPr>
+            <w:tcW w:type="dxa" w:w="2880"/>
+          </w:tcPr>
+          <w:p>
+            <w:r>
+              <w:rPr>
+                <w:b/>
+              </w:rPr>
+              <w:t>SalesBuzz · Mira · Mirna · Odoo</w:t>
+            </w:r>
+          </w:p>
+        </w:tc>
+        <w:tc>
+          <w:tcPr>
+            <w:tcW w:type="dxa" w:w="2880"/>
+          </w:tcPr>
+          <w:p>
+            <w:r>
+              <w:t>Regional SFA/DMS + accessible ERP</w:t>
+            </w:r>
+          </w:p>
+        </w:tc>
+      </w:tr>
+      <w:tr>
+        <w:tc>
+          <w:tcPr>
+            <w:tcW w:type="dxa" w:w="2880"/>
+          </w:tcPr>
+          <w:p>
+            <w:r>
+              <w:rPr>
+                <w:b/>
+              </w:rPr>
+              <w:t>P4</w:t>
+            </w:r>
+          </w:p>
+        </w:tc>
+        <w:tc>
+          <w:tcPr>
+            <w:tcW w:type="dxa" w:w="2880"/>
+          </w:tcPr>
+          <w:p>
+            <w:r>
+              <w:rPr>
+                <w:b/>
+              </w:rPr>
+              <w:t>SAP · Dynamics · Salesforce · Oracle</w:t>
+            </w:r>
+          </w:p>
+        </w:tc>
+        <w:tc>
+          <w:tcPr>
+            <w:tcW w:type="dxa" w:w="2880"/>
+          </w:tcPr>
+          <w:p>
+            <w:r>
+              <w:t>Enterprise ERP/CRM</w:t>
+            </w:r>
+          </w:p>
+        </w:tc>
+      </w:tr>
+    </w:tbl>
+    <w:p/>
+    <w:p>
+      <w:r>
+        <w:t xml:space="preserve">All tiers are </w:t>
+      </w:r>
+      <w:r>
+        <w:rPr>
+          <w:b/>
+        </w:rPr>
+        <w:t>adapters over the same connector framework</w:t>
+      </w:r>
+      <w:r>
+        <w:t xml:space="preserve"> (provider contracts above) — no tier</w:t>
+      </w:r>
+    </w:p>
+    <w:p>
+      <w:r>
+        <w:t>gets bespoke architecture. Higher tiers ship later but plug into the identical interfaces.</w:t>
+      </w:r>
+    </w:p>
+    <w:p>
+      <w:pPr>
+        <w:pStyle w:val="Heading3"/>
+      </w:pPr>
+      <w:r>
         <w:t>Design principles</w:t>
       </w:r>
     </w:p>
@@ -2262,10 +2616,24 @@
         <w:rPr>
           <w:b/>
         </w:rPr>
-        <w:t>Excel is supported permanently</w:t>
+        <w:t>Excel/CSV supported permanently</w:t>
       </w:r>
       <w:r>
-        <w:t xml:space="preserve"> (L1 never deprecated).</w:t>
+        <w:t xml:space="preserve"> (P1 never deprecated).</w:t>
+      </w:r>
+    </w:p>
+    <w:p>
+      <w:pPr>
+        <w:pStyle w:val="ListNumber"/>
+      </w:pPr>
+      <w:r>
+        <w:rPr>
+          <w:b/>
+        </w:rPr>
+        <w:t>Google Sheets is first-class</w:t>
+      </w:r>
+      <w:r>
+        <w:t xml:space="preserve"> (P2) — full import/export/scheduled-sync/write-back.</w:t>
       </w:r>
     </w:p>
     <w:p>
@@ -2279,7 +2647,7 @@
         <w:t>No vendor-specific architecture</w:t>
       </w:r>
       <w:r>
-        <w:t xml:space="preserve"> — one framework, many adapters.</w:t>
+        <w:t xml:space="preserve"> — one framework, many adapters (P1–P4).</w:t>
       </w:r>
     </w:p>
     <w:p>
@@ -2293,7 +2661,7 @@
         <w:t>Build the connector framework first</w:t>
       </w:r>
       <w:r>
-        <w:t>, then connectors.</w:t>
+        <w:t>, then connectors in priority order.</w:t>
       </w:r>
     </w:p>
     <w:p>

</xml_diff>